<commit_message>
style: ajustar plantilla Word al formato UNL 17x24
</commit_message>
<xml_diff>
--- a/plantillas/plantilla.docx
+++ b/plantillas/plantilla.docx
@@ -5,15 +5,17 @@
     <w:p>
       <w:pPr>
         <w:pStyle w:val="Ttulo"/>
-        <w:spacing w:line="240" w:lineRule="auto" w:after="40" w:before="0"/>
-        <w:jc w:val="center"/>
-      </w:pPr>
-      <w:r>
-        <w:rPr>
-          <w:rFonts w:ascii="Times New Roman" w:hAnsi="Times New Roman" w:eastAsia="Times New Roman"/>
-          <w:b/>
+        <w:spacing w:after="40"/>
+        <w:rPr>
+          <w:lang w:val="es-EC"/>
+        </w:rPr>
+      </w:pPr>
+      <w:r>
+        <w:rPr>
+          <w:rFonts w:ascii="Times New Roman" w:eastAsia="Times New Roman" w:hAnsi="Times New Roman"/>
           <w:color w:val="000000"/>
           <w:sz w:val="24"/>
+          <w:lang w:val="es-EC"/>
         </w:rPr>
         <w:t>PLANTILLA APA 7 PARA QUARTO</w:t>
       </w:r>
@@ -21,14 +23,16 @@
     <w:p>
       <w:pPr>
         <w:pStyle w:val="Subttulo"/>
-        <w:spacing w:line="240" w:lineRule="auto" w:after="40" w:before="0"/>
-        <w:jc w:val="center"/>
-      </w:pPr>
-      <w:r>
-        <w:rPr>
-          <w:rFonts w:ascii="Times New Roman" w:hAnsi="Times New Roman" w:eastAsia="Times New Roman"/>
+        <w:spacing w:after="40"/>
+        <w:rPr>
+          <w:lang w:val="es-EC"/>
+        </w:rPr>
+      </w:pPr>
+      <w:r>
+        <w:rPr>
           <w:color w:val="000000"/>
           <w:sz w:val="24"/>
+          <w:lang w:val="es-EC"/>
         </w:rPr>
         <w:t>Documento de referencia para tesis y trabajos académicos</w:t>
       </w:r>
@@ -36,246 +40,272 @@
     <w:p>
       <w:pPr>
         <w:pStyle w:val="Author"/>
-        <w:spacing w:line="240" w:lineRule="auto" w:after="40" w:before="0"/>
-        <w:jc w:val="center"/>
-      </w:pPr>
-      <w:r>
-        <w:rPr>
-          <w:rFonts w:ascii="Times New Roman" w:hAnsi="Times New Roman" w:eastAsia="Times New Roman"/>
+        <w:spacing w:before="0" w:after="40"/>
+        <w:rPr>
+          <w:lang w:val="es-EC"/>
+        </w:rPr>
+      </w:pPr>
+      <w:r>
+        <w:rPr>
+          <w:color w:val="000000"/>
+          <w:lang w:val="es-EC"/>
+        </w:rPr>
+        <w:t>Nombre del autor</w:t>
+      </w:r>
+    </w:p>
+    <w:p>
+      <w:pPr>
+        <w:pStyle w:val="Fecha"/>
+        <w:spacing w:before="0" w:after="40"/>
+        <w:rPr>
+          <w:lang w:val="es-EC"/>
+        </w:rPr>
+      </w:pPr>
+      <w:r>
+        <w:rPr>
           <w:color w:val="000000"/>
           <w:sz w:val="24"/>
-        </w:rPr>
-        <w:t>Nombre del autor</w:t>
+          <w:lang w:val="es-EC"/>
+        </w:rPr>
+        <w:t>Institución</w:t>
+      </w:r>
+      <w:r>
+        <w:rPr>
+          <w:color w:val="000000"/>
+          <w:sz w:val="24"/>
+          <w:lang w:val="es-EC"/>
+        </w:rPr>
+        <w:br/>
+        <w:t>Programa académico</w:t>
+      </w:r>
+      <w:r>
+        <w:rPr>
+          <w:color w:val="000000"/>
+          <w:sz w:val="24"/>
+          <w:lang w:val="es-EC"/>
+        </w:rPr>
+        <w:br/>
+        <w:t>Fecha</w:t>
       </w:r>
     </w:p>
     <w:p>
       <w:pPr>
-        <w:pStyle w:val="Fecha"/>
-        <w:spacing w:line="240" w:lineRule="auto" w:after="40" w:before="0"/>
+        <w:spacing w:after="40" w:line="240" w:lineRule="auto"/>
         <w:jc w:val="center"/>
-      </w:pPr>
-      <w:r>
-        <w:rPr>
-          <w:rFonts w:ascii="Times New Roman" w:hAnsi="Times New Roman" w:eastAsia="Times New Roman"/>
+        <w:rPr>
+          <w:lang w:val="es-EC"/>
+        </w:rPr>
+      </w:pPr>
+      <w:r>
+        <w:rPr>
           <w:color w:val="000000"/>
           <w:sz w:val="24"/>
-        </w:rPr>
-        <w:t>Institución</w:t>
-        <w:br/>
-        <w:t>Programa académico</w:t>
-        <w:br/>
-        <w:t>Fecha</w:t>
+          <w:lang w:val="es-EC"/>
+        </w:rPr>
+        <w:br w:type="page"/>
       </w:r>
     </w:p>
     <w:p>
       <w:pPr>
-        <w:spacing w:line="240" w:lineRule="auto" w:after="40" w:before="0"/>
-        <w:jc w:val="center"/>
-      </w:pPr>
-      <w:r>
-        <w:rPr>
-          <w:rFonts w:ascii="Times New Roman" w:hAnsi="Times New Roman" w:eastAsia="Times New Roman"/>
+        <w:pStyle w:val="Ttulo1"/>
+        <w:rPr>
+          <w:lang w:val="es-EC"/>
+        </w:rPr>
+      </w:pPr>
+      <w:r>
+        <w:rPr>
+          <w:rFonts w:eastAsia="Times New Roman"/>
           <w:color w:val="000000"/>
           <w:sz w:val="24"/>
-        </w:rPr>
-        <w:br w:type="page"/>
-      </w:r>
+          <w:lang w:val="es-EC"/>
+        </w:rPr>
+        <w:lastRenderedPageBreak/>
+        <w:t>Ejemplo de encabezado de nivel 1</w:t>
+      </w:r>
+      <w:bookmarkStart w:id="0" w:name="_GoBack"/>
+      <w:bookmarkEnd w:id="0"/>
     </w:p>
     <w:p>
       <w:pPr>
-        <w:pStyle w:val="Ttulo1"/>
-        <w:spacing w:line="240" w:lineRule="auto"/>
-      </w:pPr>
-      <w:r>
-        <w:rPr>
-          <w:rFonts w:ascii="Times New Roman" w:hAnsi="Times New Roman" w:eastAsia="Times New Roman"/>
+        <w:pStyle w:val="FirstParagraph"/>
+        <w:rPr>
+          <w:lang w:val="es-EC"/>
+        </w:rPr>
+      </w:pPr>
+      <w:r>
+        <w:rPr>
+          <w:lang w:val="es-EC"/>
+        </w:rPr>
+        <w:t xml:space="preserve">Este es el primer párrafo después de un encabezado. La plantilla utiliza Times </w:t>
+      </w:r>
+      <w:r>
+        <w:rPr>
+          <w:lang w:val="es-EC"/>
+        </w:rPr>
+        <w:t>New Roman de 12 puntos, interlineado sencillo, márgenes de 2,54 cm y alineación justificada.</w:t>
+      </w:r>
+    </w:p>
+    <w:p>
+      <w:pPr>
+        <w:pStyle w:val="Textoindependiente"/>
+        <w:rPr>
+          <w:lang w:val="es-EC"/>
+        </w:rPr>
+      </w:pPr>
+      <w:r>
+        <w:rPr>
+          <w:lang w:val="es-EC"/>
+        </w:rPr>
+        <w:t>Los párrafos siguientes tienen sangría de primera línea de 1,27 cm y una separación mínima de 2 puntos después de cada párrafo.</w:t>
+      </w:r>
+    </w:p>
+    <w:p>
+      <w:pPr>
+        <w:pStyle w:val="Ttulo2"/>
+        <w:rPr>
+          <w:lang w:val="es-EC"/>
+        </w:rPr>
+      </w:pPr>
+      <w:r>
+        <w:rPr>
+          <w:rFonts w:eastAsia="Times New Roman"/>
           <w:color w:val="000000"/>
           <w:sz w:val="24"/>
-        </w:rPr>
-        <w:t>Ejemplo de encabezado de nivel 1</w:t>
+          <w:lang w:val="es-EC"/>
+        </w:rPr>
+        <w:t>Ejemplo de encabezado de nivel 2</w:t>
       </w:r>
     </w:p>
     <w:p>
       <w:pPr>
         <w:pStyle w:val="FirstParagraph"/>
-        <w:spacing w:line="240" w:lineRule="auto" w:after="40" w:before="0"/>
-        <w:jc w:val="both"/>
-      </w:pPr>
-      <w:r>
-        <w:rPr>
-          <w:rFonts w:ascii="Times New Roman" w:hAnsi="Times New Roman" w:eastAsia="Times New Roman"/>
-          <w:color w:val="000000"/>
-          <w:sz w:val="24"/>
-        </w:rPr>
-      </w:r>
-      <w:r>
-        <w:rPr>
-          <w:rFonts w:ascii="Times New Roman" w:hAnsi="Times New Roman" w:eastAsia="Times New Roman"/>
-          <w:sz w:val="24"/>
-        </w:rPr>
-        <w:t>Este es el primer párrafo después de un encabezado. La plantilla utiliza Times New Roman de 12 puntos, interlineado sencillo, márgenes de 2,54 cm y alineación justificada.</w:t>
+        <w:rPr>
+          <w:lang w:val="es-EC"/>
+        </w:rPr>
+      </w:pPr>
+      <w:r>
+        <w:rPr>
+          <w:lang w:val="es-EC"/>
+        </w:rPr>
+        <w:t>El</w:t>
+      </w:r>
+      <w:r>
+        <w:rPr>
+          <w:lang w:val="es-EC"/>
+        </w:rPr>
+        <w:t xml:space="preserve"> nivel 2 se presenta alineado a la izquierda y en negrita.</w:t>
       </w:r>
     </w:p>
     <w:p>
       <w:pPr>
-        <w:pStyle w:val="Textoindependiente"/>
-        <w:spacing w:line="240" w:lineRule="auto" w:after="40" w:before="0"/>
-        <w:jc w:val="both"/>
-      </w:pPr>
-      <w:r>
-        <w:rPr>
-          <w:rFonts w:ascii="Times New Roman" w:hAnsi="Times New Roman" w:eastAsia="Times New Roman"/>
+        <w:pStyle w:val="Ttulo3"/>
+        <w:rPr>
+          <w:lang w:val="es-EC"/>
+        </w:rPr>
+      </w:pPr>
+      <w:r>
+        <w:rPr>
+          <w:rFonts w:eastAsia="Times New Roman"/>
           <w:color w:val="000000"/>
-          <w:sz w:val="24"/>
-        </w:rPr>
-      </w:r>
-      <w:r>
-        <w:rPr>
-          <w:rFonts w:ascii="Times New Roman" w:hAnsi="Times New Roman" w:eastAsia="Times New Roman"/>
-          <w:sz w:val="24"/>
-        </w:rPr>
-        <w:t>Los párrafos siguientes tienen sangría de primera línea de 1,27 cm y una separación mínima de 2 puntos después de cada párrafo.</w:t>
+          <w:lang w:val="es-EC"/>
+        </w:rPr>
+        <w:t>Ejemplo de encabezado de nivel 3</w:t>
       </w:r>
     </w:p>
     <w:p>
       <w:pPr>
-        <w:pStyle w:val="Ttulo2"/>
-        <w:spacing w:line="240" w:lineRule="auto"/>
-      </w:pPr>
-      <w:r>
-        <w:rPr>
-          <w:rFonts w:ascii="Times New Roman" w:hAnsi="Times New Roman" w:eastAsia="Times New Roman"/>
-          <w:color w:val="000000"/>
-          <w:sz w:val="24"/>
-        </w:rPr>
-        <w:t>Ejemplo de encabezado de nivel 2</w:t>
+        <w:pStyle w:val="FirstParagraph"/>
+        <w:rPr>
+          <w:lang w:val="es-EC"/>
+        </w:rPr>
+      </w:pPr>
+      <w:r>
+        <w:rPr>
+          <w:lang w:val="es-EC"/>
+        </w:rPr>
+        <w:t>El nivel 3 se presenta alineado a la izquierda, en negrita y cursiva.</w:t>
       </w:r>
     </w:p>
     <w:p>
       <w:pPr>
-        <w:pStyle w:val="FirstParagraph"/>
-        <w:spacing w:line="240" w:lineRule="auto" w:after="40" w:before="0"/>
-        <w:jc w:val="both"/>
-      </w:pPr>
-      <w:r>
-        <w:rPr>
-          <w:rFonts w:ascii="Times New Roman" w:hAnsi="Times New Roman" w:eastAsia="Times New Roman"/>
-          <w:color w:val="000000"/>
+        <w:pStyle w:val="Textodebloque"/>
+        <w:spacing w:before="0" w:after="40"/>
+        <w:rPr>
+          <w:lang w:val="es-EC"/>
+        </w:rPr>
+      </w:pPr>
+      <w:r>
+        <w:rPr>
           <w:sz w:val="24"/>
-        </w:rPr>
-        <w:t>El nivel 2 se presenta alineado a la izquierda y en negrita.</w:t>
+          <w:lang w:val="es-EC"/>
+        </w:rPr>
+        <w:t>Ejemplo de cita textual extensa. Las citas de 40 palabras o más se presentan en un bloque inde</w:t>
+      </w:r>
+      <w:r>
+        <w:rPr>
+          <w:sz w:val="24"/>
+          <w:lang w:val="es-EC"/>
+        </w:rPr>
+        <w:t>pendiente, con sangría izquierda de 1,27 cm, sin comillas y con interlineado sencillo.</w:t>
       </w:r>
     </w:p>
     <w:p>
       <w:pPr>
-        <w:pStyle w:val="Ttulo3"/>
-        <w:spacing w:line="240" w:lineRule="auto"/>
-      </w:pPr>
-      <w:r>
-        <w:rPr>
-          <w:rFonts w:ascii="Times New Roman" w:hAnsi="Times New Roman" w:eastAsia="Times New Roman"/>
-          <w:color w:val="000000"/>
-          <w:sz w:val="24"/>
-        </w:rPr>
-        <w:t>Ejemplo de encabezado de nivel 3</w:t>
+        <w:pStyle w:val="TableCaption"/>
+        <w:rPr>
+          <w:lang w:val="es-EC"/>
+        </w:rPr>
+      </w:pPr>
+      <w:r>
+        <w:rPr>
+          <w:b/>
+          <w:lang w:val="es-EC"/>
+        </w:rPr>
+        <w:t>Tabla 1</w:t>
       </w:r>
     </w:p>
     <w:p>
       <w:pPr>
-        <w:pStyle w:val="FirstParagraph"/>
-        <w:spacing w:line="240" w:lineRule="auto" w:after="40" w:before="0"/>
-        <w:jc w:val="both"/>
-      </w:pPr>
-      <w:r>
-        <w:rPr>
-          <w:rFonts w:ascii="Times New Roman" w:hAnsi="Times New Roman" w:eastAsia="Times New Roman"/>
-          <w:color w:val="000000"/>
-          <w:sz w:val="24"/>
-        </w:rPr>
-        <w:t>El nivel 3 se presenta alineado a la izquierda, en negrita y cursiva.</w:t>
-      </w:r>
-    </w:p>
-    <w:p>
-      <w:pPr>
-        <w:pStyle w:val="Textodebloque"/>
-        <w:spacing w:line="240" w:lineRule="auto" w:after="40" w:before="0"/>
-        <w:jc w:val="both"/>
-      </w:pPr>
-      <w:r>
-        <w:rPr>
-          <w:rFonts w:ascii="Times New Roman" w:hAnsi="Times New Roman" w:eastAsia="Times New Roman"/>
-          <w:color w:val="000000"/>
-          <w:sz w:val="24"/>
-        </w:rPr>
-      </w:r>
-      <w:r>
-        <w:rPr>
-          <w:rFonts w:ascii="Times New Roman" w:hAnsi="Times New Roman" w:eastAsia="Times New Roman"/>
-          <w:sz w:val="24"/>
-        </w:rPr>
-        <w:t>Ejemplo de cita textual extensa. Las citas de 40 palabras o más se presentan en un bloque independiente, con sangría izquierda de 1,27 cm, sin comillas y con interlineado sencillo.</w:t>
-      </w:r>
-    </w:p>
-    <w:p>
-      <w:pPr>
         <w:pStyle w:val="TableCaption"/>
-        <w:spacing w:line="240" w:lineRule="auto" w:after="20" w:before="0"/>
-      </w:pPr>
-      <w:r>
-        <w:rPr>
-          <w:rFonts w:ascii="Times New Roman" w:hAnsi="Times New Roman" w:eastAsia="Times New Roman"/>
-          <w:b/>
-          <w:color w:val="000000"/>
-          <w:sz w:val="20"/>
-        </w:rPr>
-        <w:t>Tabla 1</w:t>
-      </w:r>
-    </w:p>
-    <w:p>
-      <w:pPr>
-        <w:pStyle w:val="TableCaption"/>
-        <w:spacing w:line="240" w:lineRule="auto" w:after="20" w:before="0"/>
-      </w:pPr>
-      <w:r>
-        <w:rPr>
-          <w:rFonts w:ascii="Times New Roman" w:hAnsi="Times New Roman" w:eastAsia="Times New Roman"/>
+        <w:rPr>
+          <w:lang w:val="es-EC"/>
+        </w:rPr>
+      </w:pPr>
+      <w:r>
+        <w:rPr>
           <w:i/>
-          <w:color w:val="000000"/>
-          <w:sz w:val="20"/>
+          <w:lang w:val="es-EC"/>
         </w:rPr>
         <w:t>Ejemplo de tabla en formato APA</w:t>
       </w:r>
     </w:p>
     <w:tbl>
       <w:tblPr>
-        <w:tblW w:type="auto" w:w="0"/>
+        <w:tblW w:w="0" w:type="auto"/>
         <w:jc w:val="center"/>
-        <w:tblLayout w:type="autofit"/>
-        <w:tblLook w:firstColumn="1" w:firstRow="1" w:lastColumn="0" w:lastRow="0" w:noHBand="0" w:noVBand="1" w:val="04A0"/>
+        <w:tblLook w:val="04A0" w:firstRow="1" w:lastRow="0" w:firstColumn="1" w:lastColumn="0" w:noHBand="0" w:noVBand="1"/>
       </w:tblPr>
       <w:tblGrid>
-        <w:gridCol w:w="3120"/>
-        <w:gridCol w:w="3120"/>
-        <w:gridCol w:w="3120"/>
+        <w:gridCol w:w="2410"/>
+        <w:gridCol w:w="2337"/>
+        <w:gridCol w:w="2272"/>
       </w:tblGrid>
       <w:tr>
+        <w:trPr>
+          <w:jc w:val="center"/>
+        </w:trPr>
         <w:tc>
           <w:tcPr>
-            <w:tcW w:type="dxa" w:w="3120"/>
+            <w:tcW w:w="3120" w:type="dxa"/>
             <w:vAlign w:val="center"/>
           </w:tcPr>
           <w:p>
             <w:pPr>
               <w:pStyle w:val="TableText"/>
-              <w:spacing w:line="240" w:lineRule="auto" w:before="0" w:after="0"/>
-              <w:jc w:val="left"/>
             </w:pPr>
             <w:r>
               <w:rPr>
-                <w:rFonts w:ascii="Times New Roman" w:hAnsi="Times New Roman" w:eastAsia="Times New Roman"/>
                 <w:b/>
-                <w:color w:val="000000"/>
-                <w:sz w:val="20"/>
               </w:rPr>
               <w:t>Variable</w:t>
             </w:r>
@@ -283,21 +313,16 @@
         </w:tc>
         <w:tc>
           <w:tcPr>
-            <w:tcW w:type="dxa" w:w="3120"/>
+            <w:tcW w:w="3120" w:type="dxa"/>
             <w:vAlign w:val="center"/>
           </w:tcPr>
           <w:p>
             <w:pPr>
               <w:pStyle w:val="TableText"/>
-              <w:spacing w:line="240" w:lineRule="auto" w:before="0" w:after="0"/>
-              <w:jc w:val="left"/>
             </w:pPr>
             <w:r>
               <w:rPr>
-                <w:rFonts w:ascii="Times New Roman" w:hAnsi="Times New Roman" w:eastAsia="Times New Roman"/>
                 <w:b/>
-                <w:color w:val="000000"/>
-                <w:sz w:val="20"/>
               </w:rPr>
               <w:t>Media</w:t>
             </w:r>
@@ -305,21 +330,16 @@
         </w:tc>
         <w:tc>
           <w:tcPr>
-            <w:tcW w:type="dxa" w:w="3120"/>
+            <w:tcW w:w="3120" w:type="dxa"/>
             <w:vAlign w:val="center"/>
           </w:tcPr>
           <w:p>
             <w:pPr>
               <w:pStyle w:val="TableText"/>
-              <w:spacing w:line="240" w:lineRule="auto" w:before="0" w:after="0"/>
-              <w:jc w:val="left"/>
             </w:pPr>
             <w:r>
               <w:rPr>
-                <w:rFonts w:ascii="Times New Roman" w:hAnsi="Times New Roman" w:eastAsia="Times New Roman"/>
                 <w:b/>
-                <w:color w:val="000000"/>
-                <w:sz w:val="20"/>
               </w:rPr>
               <w:t>DE</w:t>
             </w:r>
@@ -327,130 +347,100 @@
         </w:tc>
       </w:tr>
       <w:tr>
+        <w:trPr>
+          <w:jc w:val="center"/>
+        </w:trPr>
         <w:tc>
           <w:tcPr>
-            <w:tcW w:type="dxa" w:w="3120"/>
+            <w:tcW w:w="3120" w:type="dxa"/>
             <w:vAlign w:val="center"/>
           </w:tcPr>
           <w:p>
             <w:pPr>
               <w:pStyle w:val="TableText"/>
-              <w:spacing w:line="240" w:lineRule="auto" w:before="0" w:after="0"/>
               <w:jc w:val="center"/>
             </w:pPr>
             <w:r>
-              <w:rPr>
-                <w:rFonts w:ascii="Times New Roman" w:hAnsi="Times New Roman" w:eastAsia="Times New Roman"/>
-                <w:color w:val="000000"/>
-                <w:sz w:val="20"/>
-              </w:rPr>
               <w:t>Indicador A</w:t>
             </w:r>
           </w:p>
         </w:tc>
         <w:tc>
           <w:tcPr>
-            <w:tcW w:type="dxa" w:w="3120"/>
+            <w:tcW w:w="3120" w:type="dxa"/>
             <w:vAlign w:val="center"/>
           </w:tcPr>
           <w:p>
             <w:pPr>
               <w:pStyle w:val="TableText"/>
-              <w:spacing w:line="240" w:lineRule="auto" w:before="0" w:after="0"/>
               <w:jc w:val="center"/>
             </w:pPr>
             <w:r>
-              <w:rPr>
-                <w:rFonts w:ascii="Times New Roman" w:hAnsi="Times New Roman" w:eastAsia="Times New Roman"/>
-                <w:color w:val="000000"/>
-                <w:sz w:val="20"/>
-              </w:rPr>
               <w:t>12,40</w:t>
             </w:r>
           </w:p>
         </w:tc>
         <w:tc>
           <w:tcPr>
-            <w:tcW w:type="dxa" w:w="3120"/>
+            <w:tcW w:w="3120" w:type="dxa"/>
             <w:vAlign w:val="center"/>
           </w:tcPr>
           <w:p>
             <w:pPr>
               <w:pStyle w:val="TableText"/>
-              <w:spacing w:line="240" w:lineRule="auto" w:before="0" w:after="0"/>
               <w:jc w:val="center"/>
             </w:pPr>
             <w:r>
-              <w:rPr>
-                <w:rFonts w:ascii="Times New Roman" w:hAnsi="Times New Roman" w:eastAsia="Times New Roman"/>
-                <w:color w:val="000000"/>
-                <w:sz w:val="20"/>
-              </w:rPr>
               <w:t>2,10</w:t>
             </w:r>
           </w:p>
         </w:tc>
       </w:tr>
       <w:tr>
+        <w:trPr>
+          <w:jc w:val="center"/>
+        </w:trPr>
         <w:tc>
           <w:tcPr>
-            <w:tcW w:type="dxa" w:w="3120"/>
+            <w:tcW w:w="3120" w:type="dxa"/>
             <w:vAlign w:val="center"/>
           </w:tcPr>
           <w:p>
             <w:pPr>
               <w:pStyle w:val="TableText"/>
-              <w:spacing w:line="240" w:lineRule="auto" w:before="0" w:after="0"/>
               <w:jc w:val="center"/>
             </w:pPr>
             <w:r>
-              <w:rPr>
-                <w:rFonts w:ascii="Times New Roman" w:hAnsi="Times New Roman" w:eastAsia="Times New Roman"/>
-                <w:color w:val="000000"/>
-                <w:sz w:val="20"/>
-              </w:rPr>
               <w:t>Indicador B</w:t>
             </w:r>
           </w:p>
         </w:tc>
         <w:tc>
           <w:tcPr>
-            <w:tcW w:type="dxa" w:w="3120"/>
+            <w:tcW w:w="3120" w:type="dxa"/>
             <w:vAlign w:val="center"/>
           </w:tcPr>
           <w:p>
             <w:pPr>
               <w:pStyle w:val="TableText"/>
-              <w:spacing w:line="240" w:lineRule="auto" w:before="0" w:after="0"/>
               <w:jc w:val="center"/>
             </w:pPr>
             <w:r>
-              <w:rPr>
-                <w:rFonts w:ascii="Times New Roman" w:hAnsi="Times New Roman" w:eastAsia="Times New Roman"/>
-                <w:color w:val="000000"/>
-                <w:sz w:val="20"/>
-              </w:rPr>
               <w:t>18,75</w:t>
             </w:r>
           </w:p>
         </w:tc>
         <w:tc>
           <w:tcPr>
-            <w:tcW w:type="dxa" w:w="3120"/>
+            <w:tcW w:w="3120" w:type="dxa"/>
             <w:vAlign w:val="center"/>
           </w:tcPr>
           <w:p>
             <w:pPr>
               <w:pStyle w:val="TableText"/>
-              <w:spacing w:line="240" w:lineRule="auto" w:before="0" w:after="0"/>
               <w:jc w:val="center"/>
             </w:pPr>
             <w:r>
-              <w:rPr>
-                <w:rFonts w:ascii="Times New Roman" w:hAnsi="Times New Roman" w:eastAsia="Times New Roman"/>
-                <w:color w:val="000000"/>
-                <w:sz w:val="20"/>
-              </w:rPr>
               <w:t>3,42</w:t>
             </w:r>
           </w:p>
@@ -460,63 +450,77 @@
     <w:p>
       <w:pPr>
         <w:pStyle w:val="TableNote"/>
-        <w:spacing w:line="240" w:lineRule="auto" w:after="20" w:before="0"/>
-      </w:pPr>
-      <w:r>
-        <w:rPr>
-          <w:rFonts w:ascii="Times New Roman" w:hAnsi="Times New Roman" w:eastAsia="Times New Roman"/>
+        <w:rPr>
+          <w:lang w:val="es-EC"/>
+        </w:rPr>
+      </w:pPr>
+      <w:r>
+        <w:rPr>
           <w:i/>
-          <w:color w:val="000000"/>
-          <w:sz w:val="20"/>
+          <w:lang w:val="es-EC"/>
         </w:rPr>
         <w:t xml:space="preserve">Nota. </w:t>
       </w:r>
       <w:r>
         <w:rPr>
-          <w:rFonts w:ascii="Times New Roman" w:hAnsi="Times New Roman" w:eastAsia="Times New Roman"/>
-          <w:color w:val="000000"/>
-          <w:sz w:val="20"/>
-        </w:rPr>
-        <w:t>El contenido de las tablas utiliza Times New Roman de 10 puntos e interlineado sencillo.</w:t>
+          <w:lang w:val="es-EC"/>
+        </w:rPr>
+        <w:t>El contenido de las tablas utiliza Times New Roman de 10</w:t>
+      </w:r>
+      <w:r>
+        <w:rPr>
+          <w:lang w:val="es-EC"/>
+        </w:rPr>
+        <w:t xml:space="preserve"> puntos e interlineado sencillo.</w:t>
       </w:r>
     </w:p>
     <w:p>
       <w:pPr>
         <w:pStyle w:val="Ttulo1"/>
-        <w:spacing w:line="240" w:lineRule="auto"/>
-      </w:pPr>
-      <w:r>
-        <w:rPr>
-          <w:rFonts w:ascii="Times New Roman" w:hAnsi="Times New Roman" w:eastAsia="Times New Roman"/>
+        <w:rPr>
+          <w:lang w:val="es-EC"/>
+        </w:rPr>
+      </w:pPr>
+      <w:r>
+        <w:rPr>
+          <w:rFonts w:eastAsia="Times New Roman"/>
           <w:color w:val="000000"/>
           <w:sz w:val="24"/>
-        </w:rPr>
+          <w:lang w:val="es-EC"/>
+        </w:rPr>
+        <w:lastRenderedPageBreak/>
         <w:t>Referencias</w:t>
       </w:r>
     </w:p>
     <w:p>
       <w:pPr>
         <w:pStyle w:val="Bibliografa"/>
-        <w:spacing w:line="240" w:lineRule="auto" w:after="40" w:before="0"/>
-        <w:jc w:val="both"/>
-      </w:pPr>
-      <w:r>
-        <w:rPr>
-          <w:rFonts w:ascii="Times New Roman" w:hAnsi="Times New Roman" w:eastAsia="Times New Roman"/>
+        <w:spacing w:after="40"/>
+      </w:pPr>
+      <w:r>
+        <w:rPr>
           <w:color w:val="000000"/>
           <w:sz w:val="24"/>
-        </w:rPr>
-        <w:t>Apellido, A. A. (2024). Título de la obra. Editorial.</w:t>
+          <w:lang w:val="es-EC"/>
+        </w:rPr>
+        <w:t xml:space="preserve">Apellido, A. A. (2024). Título de la obra. </w:t>
+      </w:r>
+      <w:r>
+        <w:rPr>
+          <w:color w:val="000000"/>
+          <w:sz w:val="24"/>
+        </w:rPr>
+        <w:t>Editorial.</w:t>
       </w:r>
     </w:p>
     <w:sectPr>
-      <w:headerReference w:type="default" r:id="rId10"/>
-      <w:footerReference w:type="default" r:id="rId11"/>
+      <w:headerReference w:type="default" r:id="rId7"/>
+      <w:footerReference w:type="default" r:id="rId8"/>
       <w:footnotePr>
         <w:numRestart w:val="eachSect"/>
       </w:footnotePr>
-      <w:pgSz w:w="12240" w:h="15840"/>
-      <w:pgMar w:top="1224" w:right="1224" w:bottom="1152" w:left="1440" w:header="504" w:footer="504" w:gutter="0"/>
+      <w:pgSz w:w="9639" w:h="13608"/>
+      <w:pgMar w:top="1418" w:right="1418" w:bottom="1418" w:left="1418" w:header="505" w:footer="505" w:gutter="0"/>
       <w:cols w:space="720"/>
     </w:sectPr>
   </w:body>
@@ -549,20 +553,45 @@
 </file>
 
 <file path=word/footer1.xml><?xml version="1.0" encoding="utf-8"?>
-<w:ftr xmlns:m="http://schemas.openxmlformats.org/officeDocument/2006/math" xmlns:mc="http://schemas.openxmlformats.org/markup-compatibility/2006" xmlns:mo="http://schemas.microsoft.com/office/mac/office/2008/main" xmlns:mv="urn:schemas-microsoft-com:mac:vml" xmlns:o="urn:schemas-microsoft-com:office:office" xmlns:r="http://schemas.openxmlformats.org/officeDocument/2006/relationships" xmlns:v="urn:schemas-microsoft-com:vml" xmlns:w10="urn:schemas-microsoft-com:office:word" xmlns:w14="http://schemas.microsoft.com/office/word/2010/wordml" xmlns:w="http://schemas.openxmlformats.org/wordprocessingml/2006/main" xmlns:wne="http://schemas.microsoft.com/office/word/2006/wordml" xmlns:wp14="http://schemas.microsoft.com/office/word/2010/wordprocessingDrawing" xmlns:wp="http://schemas.openxmlformats.org/drawingml/2006/wordprocessingDrawing" xmlns:wpc="http://schemas.microsoft.com/office/word/2010/wordprocessingCanvas" xmlns:wpg="http://schemas.microsoft.com/office/word/2010/wordprocessingGroup" xmlns:wpi="http://schemas.microsoft.com/office/word/2010/wordprocessingInk" xmlns:wps="http://schemas.microsoft.com/office/word/2010/wordprocessingShape" mc:Ignorable="w14 wp14">
+<w:ftr xmlns:wpc="http://schemas.microsoft.com/office/word/2010/wordprocessingCanvas" xmlns:cx="http://schemas.microsoft.com/office/drawing/2014/chartex" xmlns:cx1="http://schemas.microsoft.com/office/drawing/2015/9/8/chartex" xmlns:cx2="http://schemas.microsoft.com/office/drawing/2015/10/21/chartex" xmlns:cx3="http://schemas.microsoft.com/office/drawing/2016/5/9/chartex" xmlns:cx4="http://schemas.microsoft.com/office/drawing/2016/5/10/chartex" xmlns:cx5="http://schemas.microsoft.com/office/drawing/2016/5/11/chartex" xmlns:cx6="http://schemas.microsoft.com/office/drawing/2016/5/12/chartex" xmlns:cx7="http://schemas.microsoft.com/office/drawing/2016/5/13/chartex" xmlns:cx8="http://schemas.microsoft.com/office/drawing/2016/5/14/chartex" xmlns:mc="http://schemas.openxmlformats.org/markup-compatibility/2006" xmlns:aink="http://schemas.microsoft.com/office/drawing/2016/ink" xmlns:am3d="http://schemas.microsoft.com/office/drawing/2017/model3d" xmlns:o="urn:schemas-microsoft-com:office:office" xmlns:r="http://schemas.openxmlformats.org/officeDocument/2006/relationships" xmlns:m="http://schemas.openxmlformats.org/officeDocument/2006/math" xmlns:v="urn:schemas-microsoft-com:vml" xmlns:wp14="http://schemas.microsoft.com/office/word/2010/wordprocessingDrawing" xmlns:wp="http://schemas.openxmlformats.org/drawingml/2006/wordprocessingDrawing" xmlns:w10="urn:schemas-microsoft-com:office:word" xmlns:w="http://schemas.openxmlformats.org/wordprocessingml/2006/main" xmlns:w14="http://schemas.microsoft.com/office/word/2010/wordml" xmlns:w15="http://schemas.microsoft.com/office/word/2012/wordml" xmlns:w16cid="http://schemas.microsoft.com/office/word/2016/wordml/cid" xmlns:w16se="http://schemas.microsoft.com/office/word/2015/wordml/symex" xmlns:wpg="http://schemas.microsoft.com/office/word/2010/wordprocessingGroup" xmlns:wpi="http://schemas.microsoft.com/office/word/2010/wordprocessingInk" xmlns:wne="http://schemas.microsoft.com/office/word/2006/wordml" xmlns:wps="http://schemas.microsoft.com/office/word/2010/wordprocessingShape" mc:Ignorable="w14 w15 w16se w16cid wp14">
   <w:p>
     <w:pPr>
-      <w:pStyle w:val="Footer"/>
       <w:jc w:val="center"/>
     </w:pPr>
     <w:r>
       <w:rPr>
-        <w:rFonts w:ascii="Times New Roman" w:hAnsi="Times New Roman"/>
         <w:color w:val="666666"/>
         <w:sz w:val="18"/>
       </w:rPr>
       <w:fldChar w:fldCharType="begin"/>
+    </w:r>
+    <w:r>
+      <w:rPr>
+        <w:color w:val="666666"/>
+        <w:sz w:val="18"/>
+      </w:rPr>
       <w:instrText xml:space="preserve"> PAGE </w:instrText>
+    </w:r>
+    <w:r>
+      <w:rPr>
+        <w:color w:val="666666"/>
+        <w:sz w:val="18"/>
+      </w:rPr>
+      <w:fldChar w:fldCharType="separate"/>
+    </w:r>
+    <w:r>
+      <w:rPr>
+        <w:noProof/>
+        <w:color w:val="666666"/>
+        <w:sz w:val="18"/>
+      </w:rPr>
+      <w:t>538</w:t>
+    </w:r>
+    <w:r>
+      <w:rPr>
+        <w:color w:val="666666"/>
+        <w:sz w:val="18"/>
+      </w:rPr>
       <w:fldChar w:fldCharType="end"/>
     </w:r>
   </w:p>
@@ -585,48 +614,26 @@
       </w:r>
     </w:p>
   </w:footnote>
-  <w:footnote w:id="1">
-    <w:p>
-      <w:pPr>
-        <w:pStyle w:val="Textonotapie"/>
-      </w:pPr>
-      <w:r>
-        <w:rPr>
-          <w:rStyle w:val="Refdenotaalpie"/>
-        </w:rPr>
-        <w:footnoteRef/>
-      </w:r>
-      <w:r>
-        <w:t>Footnote Text.</w:t>
-      </w:r>
-    </w:p>
-    <w:p>
-      <w:pPr>
-        <w:pStyle w:val="FootnoteBlockText"/>
-      </w:pPr>
-      <w:r>
-        <w:t>Footnote Block Text</w:t>
-      </w:r>
-    </w:p>
-  </w:footnote>
 </w:footnotes>
 </file>
 
 <file path=word/header1.xml><?xml version="1.0" encoding="utf-8"?>
-<w:hdr xmlns:m="http://schemas.openxmlformats.org/officeDocument/2006/math" xmlns:mc="http://schemas.openxmlformats.org/markup-compatibility/2006" xmlns:mo="http://schemas.microsoft.com/office/mac/office/2008/main" xmlns:mv="urn:schemas-microsoft-com:mac:vml" xmlns:o="urn:schemas-microsoft-com:office:office" xmlns:r="http://schemas.openxmlformats.org/officeDocument/2006/relationships" xmlns:v="urn:schemas-microsoft-com:vml" xmlns:w10="urn:schemas-microsoft-com:office:word" xmlns:w14="http://schemas.microsoft.com/office/word/2010/wordml" xmlns:w="http://schemas.openxmlformats.org/wordprocessingml/2006/main" xmlns:wne="http://schemas.microsoft.com/office/word/2006/wordml" xmlns:wp14="http://schemas.microsoft.com/office/word/2010/wordprocessingDrawing" xmlns:wp="http://schemas.openxmlformats.org/drawingml/2006/wordprocessingDrawing" xmlns:wpc="http://schemas.microsoft.com/office/word/2010/wordprocessingCanvas" xmlns:wpg="http://schemas.microsoft.com/office/word/2010/wordprocessingGroup" xmlns:wpi="http://schemas.microsoft.com/office/word/2010/wordprocessingInk" xmlns:wps="http://schemas.microsoft.com/office/word/2010/wordprocessingShape" mc:Ignorable="w14 wp14">
+<w:hdr xmlns:wpc="http://schemas.microsoft.com/office/word/2010/wordprocessingCanvas" xmlns:cx="http://schemas.microsoft.com/office/drawing/2014/chartex" xmlns:cx1="http://schemas.microsoft.com/office/drawing/2015/9/8/chartex" xmlns:cx2="http://schemas.microsoft.com/office/drawing/2015/10/21/chartex" xmlns:cx3="http://schemas.microsoft.com/office/drawing/2016/5/9/chartex" xmlns:cx4="http://schemas.microsoft.com/office/drawing/2016/5/10/chartex" xmlns:cx5="http://schemas.microsoft.com/office/drawing/2016/5/11/chartex" xmlns:cx6="http://schemas.microsoft.com/office/drawing/2016/5/12/chartex" xmlns:cx7="http://schemas.microsoft.com/office/drawing/2016/5/13/chartex" xmlns:cx8="http://schemas.microsoft.com/office/drawing/2016/5/14/chartex" xmlns:mc="http://schemas.openxmlformats.org/markup-compatibility/2006" xmlns:aink="http://schemas.microsoft.com/office/drawing/2016/ink" xmlns:am3d="http://schemas.microsoft.com/office/drawing/2017/model3d" xmlns:o="urn:schemas-microsoft-com:office:office" xmlns:r="http://schemas.openxmlformats.org/officeDocument/2006/relationships" xmlns:m="http://schemas.openxmlformats.org/officeDocument/2006/math" xmlns:v="urn:schemas-microsoft-com:vml" xmlns:wp14="http://schemas.microsoft.com/office/word/2010/wordprocessingDrawing" xmlns:wp="http://schemas.openxmlformats.org/drawingml/2006/wordprocessingDrawing" xmlns:w10="urn:schemas-microsoft-com:office:word" xmlns:w="http://schemas.openxmlformats.org/wordprocessingml/2006/main" xmlns:w14="http://schemas.microsoft.com/office/word/2010/wordml" xmlns:w15="http://schemas.microsoft.com/office/word/2012/wordml" xmlns:w16cid="http://schemas.microsoft.com/office/word/2016/wordml/cid" xmlns:w16se="http://schemas.microsoft.com/office/word/2015/wordml/symex" xmlns:wpg="http://schemas.microsoft.com/office/word/2010/wordprocessingGroup" xmlns:wpi="http://schemas.microsoft.com/office/word/2010/wordprocessingInk" xmlns:wne="http://schemas.microsoft.com/office/word/2006/wordml" xmlns:wps="http://schemas.microsoft.com/office/word/2010/wordprocessingShape" mc:Ignorable="w14 w15 w16se w16cid wp14">
   <w:p>
     <w:pPr>
-      <w:pStyle w:val="Header"/>
-      <w:jc w:val="right"/>
       <w:pBdr>
         <w:bottom w:val="single" w:sz="4" w:space="4" w:color="B7C9D6"/>
       </w:pBdr>
+      <w:jc w:val="right"/>
+      <w:rPr>
+        <w:lang w:val="es-EC"/>
+      </w:rPr>
     </w:pPr>
     <w:r>
       <w:rPr>
-        <w:rFonts w:ascii="Times New Roman" w:hAnsi="Times New Roman"/>
         <w:color w:val="666666"/>
         <w:sz w:val="16"/>
+        <w:lang w:val="es-EC"/>
       </w:rPr>
       <w:t>INVESTIGACIÓN REPRODUCIBLE CON R Y QUARTO</w:t>
     </w:r>
@@ -1319,15 +1326,12 @@
     <w:qFormat/>
     <w:rsid w:val="00DA19DD"/>
     <w:pPr>
-      <w:widowControl/>
-      <w:spacing w:after="120" w:line="276" w:lineRule="auto" w:before="0"/>
-      <w:ind w:firstLine="720" w:left="0" w:right="0"/>
+      <w:spacing w:after="120" w:line="276" w:lineRule="auto"/>
+      <w:ind w:firstLine="720"/>
       <w:jc w:val="both"/>
     </w:pPr>
     <w:rPr>
-      <w:rFonts w:ascii="Times New Roman" w:hAnsi="Times New Roman" w:eastAsia="Times New Roman" w:cs="Times New Roman"/>
-      <w:b w:val="0"/>
-      <w:i w:val="0"/>
+      <w:rFonts w:ascii="Times New Roman" w:eastAsia="Times New Roman" w:hAnsi="Times New Roman" w:cs="Times New Roman"/>
       <w:color w:val="222222"/>
       <w:sz w:val="23"/>
     </w:rPr>
@@ -1344,16 +1348,14 @@
       <w:keepNext/>
       <w:keepLines/>
       <w:pageBreakBefore/>
-      <w:widowControl/>
       <w:spacing w:before="360" w:after="200" w:line="240" w:lineRule="auto"/>
-      <w:ind w:firstLine="0" w:left="0" w:right="0"/>
+      <w:ind w:firstLine="0"/>
       <w:jc w:val="left"/>
       <w:outlineLvl w:val="0"/>
     </w:pPr>
     <w:rPr>
-      <w:rFonts w:eastAsiaTheme="majorEastAsia" w:cstheme="majorBidi" w:ascii="Times New Roman" w:hAnsi="Times New Roman" w:eastAsia="Times New Roman" w:cs="Times New Roman"/>
+      <w:rFonts w:eastAsiaTheme="majorEastAsia" w:cstheme="majorBidi"/>
       <w:b/>
-      <w:i w:val="0"/>
       <w:color w:val="1F4E79"/>
       <w:sz w:val="34"/>
       <w:szCs w:val="40"/>
@@ -1371,16 +1373,14 @@
     <w:pPr>
       <w:keepNext/>
       <w:keepLines/>
-      <w:widowControl/>
-      <w:spacing w:before="280" w:after="120" w:line="240" w:lineRule="auto"/>
-      <w:ind w:firstLine="0" w:left="0" w:right="0"/>
+      <w:spacing w:before="280" w:line="240" w:lineRule="auto"/>
+      <w:ind w:firstLine="0"/>
       <w:jc w:val="left"/>
       <w:outlineLvl w:val="1"/>
     </w:pPr>
     <w:rPr>
-      <w:rFonts w:eastAsiaTheme="majorEastAsia" w:cstheme="majorBidi" w:ascii="Times New Roman" w:hAnsi="Times New Roman" w:eastAsia="Times New Roman" w:cs="Times New Roman"/>
+      <w:rFonts w:eastAsiaTheme="majorEastAsia" w:cstheme="majorBidi"/>
       <w:b/>
-      <w:i w:val="0"/>
       <w:color w:val="1F4E79"/>
       <w:sz w:val="28"/>
       <w:szCs w:val="32"/>
@@ -1399,16 +1399,14 @@
     <w:pPr>
       <w:keepNext/>
       <w:keepLines/>
-      <w:widowControl/>
       <w:spacing w:before="200" w:after="80" w:line="240" w:lineRule="auto"/>
-      <w:ind w:firstLine="0" w:left="0" w:right="0"/>
+      <w:ind w:firstLine="0"/>
       <w:jc w:val="left"/>
       <w:outlineLvl w:val="2"/>
     </w:pPr>
     <w:rPr>
-      <w:rFonts w:eastAsiaTheme="majorEastAsia" w:cstheme="majorBidi" w:ascii="Times New Roman" w:hAnsi="Times New Roman" w:eastAsia="Times New Roman" w:cs="Times New Roman"/>
+      <w:rFonts w:eastAsiaTheme="majorEastAsia" w:cstheme="majorBidi"/>
       <w:b/>
-      <w:i w:val="0"/>
       <w:color w:val="1F4E79"/>
       <w:sz w:val="24"/>
       <w:szCs w:val="28"/>
@@ -1427,19 +1425,16 @@
     <w:pPr>
       <w:keepNext/>
       <w:keepLines/>
-      <w:widowControl/>
       <w:spacing w:before="160" w:after="60" w:line="480" w:lineRule="auto"/>
-      <w:ind w:firstLine="720" w:left="0" w:right="0"/>
       <w:jc w:val="left"/>
       <w:outlineLvl w:val="3"/>
     </w:pPr>
     <w:rPr>
-      <w:rFonts w:eastAsiaTheme="majorEastAsia" w:cstheme="majorBidi" w:ascii="Times New Roman" w:hAnsi="Times New Roman" w:eastAsia="Times New Roman" w:cs="Times New Roman"/>
+      <w:rFonts w:eastAsiaTheme="majorEastAsia" w:cstheme="majorBidi"/>
       <w:b/>
       <w:i/>
       <w:iCs/>
       <w:color w:val="1F4E79"/>
-      <w:sz w:val="23"/>
     </w:rPr>
   </w:style>
   <w:style w:type="paragraph" w:styleId="Ttulo5">
@@ -1455,13 +1450,12 @@
     <w:pPr>
       <w:keepNext/>
       <w:keepLines/>
-      <w:spacing w:before="0" w:after="0" w:line="480" w:lineRule="auto"/>
-      <w:ind w:firstLine="720" w:left="0" w:right="0"/>
+      <w:spacing w:after="0" w:line="480" w:lineRule="auto"/>
       <w:jc w:val="left"/>
       <w:outlineLvl w:val="4"/>
     </w:pPr>
     <w:rPr>
-      <w:rFonts w:eastAsiaTheme="majorEastAsia" w:cstheme="majorBidi" w:ascii="Times New Roman" w:hAnsi="Times New Roman" w:eastAsia="Times New Roman" w:cs="Times New Roman"/>
+      <w:rFonts w:eastAsiaTheme="majorEastAsia" w:cstheme="majorBidi"/>
       <w:b/>
       <w:i/>
       <w:color w:val="000000"/>
@@ -1481,13 +1475,13 @@
     <w:pPr>
       <w:keepNext/>
       <w:keepLines/>
-      <w:spacing w:before="0" w:after="0" w:line="480" w:lineRule="auto"/>
-      <w:ind w:firstLine="0" w:left="0" w:right="0"/>
+      <w:spacing w:after="0" w:line="480" w:lineRule="auto"/>
+      <w:ind w:firstLine="0"/>
       <w:jc w:val="left"/>
       <w:outlineLvl w:val="5"/>
     </w:pPr>
     <w:rPr>
-      <w:rFonts w:eastAsiaTheme="majorEastAsia" w:cstheme="majorBidi" w:ascii="Times New Roman" w:hAnsi="Times New Roman" w:eastAsia="Times New Roman" w:cs="Times New Roman"/>
+      <w:rFonts w:eastAsiaTheme="majorEastAsia" w:cstheme="majorBidi"/>
       <w:b/>
       <w:i/>
       <w:iCs/>
@@ -1508,13 +1502,13 @@
     <w:pPr>
       <w:keepNext/>
       <w:keepLines/>
-      <w:spacing w:before="0" w:after="0" w:line="480" w:lineRule="auto"/>
-      <w:ind w:firstLine="0" w:left="0" w:right="0"/>
+      <w:spacing w:after="0" w:line="480" w:lineRule="auto"/>
+      <w:ind w:firstLine="0"/>
       <w:jc w:val="left"/>
       <w:outlineLvl w:val="6"/>
     </w:pPr>
     <w:rPr>
-      <w:rFonts w:eastAsiaTheme="majorEastAsia" w:cstheme="majorBidi" w:ascii="Times New Roman" w:hAnsi="Times New Roman" w:eastAsia="Times New Roman" w:cs="Times New Roman"/>
+      <w:rFonts w:eastAsiaTheme="majorEastAsia" w:cstheme="majorBidi"/>
       <w:b/>
       <w:color w:val="595959" w:themeColor="text1" w:themeTint="A6"/>
       <w:sz w:val="24"/>
@@ -1533,13 +1527,13 @@
     <w:pPr>
       <w:keepNext/>
       <w:keepLines/>
-      <w:spacing w:before="0" w:after="0" w:line="480" w:lineRule="auto"/>
-      <w:ind w:firstLine="0" w:left="0" w:right="0"/>
+      <w:spacing w:after="0" w:line="480" w:lineRule="auto"/>
+      <w:ind w:firstLine="0"/>
       <w:jc w:val="left"/>
       <w:outlineLvl w:val="7"/>
     </w:pPr>
     <w:rPr>
-      <w:rFonts w:eastAsiaTheme="majorEastAsia" w:cstheme="majorBidi" w:ascii="Times New Roman" w:hAnsi="Times New Roman" w:eastAsia="Times New Roman" w:cs="Times New Roman"/>
+      <w:rFonts w:eastAsiaTheme="majorEastAsia" w:cstheme="majorBidi"/>
       <w:b/>
       <w:i/>
       <w:iCs/>
@@ -1560,13 +1554,13 @@
     <w:pPr>
       <w:keepNext/>
       <w:keepLines/>
-      <w:spacing w:before="0" w:after="0" w:line="480" w:lineRule="auto"/>
-      <w:ind w:firstLine="0" w:left="0" w:right="0"/>
+      <w:spacing w:after="0" w:line="480" w:lineRule="auto"/>
+      <w:ind w:firstLine="0"/>
       <w:jc w:val="left"/>
       <w:outlineLvl w:val="8"/>
     </w:pPr>
     <w:rPr>
-      <w:rFonts w:eastAsiaTheme="majorEastAsia" w:cstheme="majorBidi" w:ascii="Times New Roman" w:hAnsi="Times New Roman" w:eastAsia="Times New Roman" w:cs="Times New Roman"/>
+      <w:rFonts w:eastAsiaTheme="majorEastAsia" w:cstheme="majorBidi"/>
       <w:b/>
       <w:color w:val="272727" w:themeColor="text1" w:themeTint="D8"/>
       <w:sz w:val="24"/>
@@ -1605,14 +1599,9 @@
     <w:link w:val="TextoindependienteCar"/>
     <w:qFormat/>
     <w:pPr>
-      <w:spacing w:before="0" w:after="40" w:line="240" w:lineRule="auto"/>
-      <w:ind w:left="0" w:right="0" w:firstLine="720"/>
-      <w:jc w:val="both"/>
-    </w:pPr>
-    <w:rPr>
-      <w:rFonts w:ascii="Times New Roman" w:hAnsi="Times New Roman" w:eastAsia="Times New Roman" w:cs="Times New Roman"/>
-      <w:b w:val="0"/>
-      <w:i w:val="0"/>
+      <w:spacing w:after="40" w:line="240" w:lineRule="auto"/>
+    </w:pPr>
+    <w:rPr>
       <w:color w:val="000000"/>
       <w:sz w:val="24"/>
     </w:rPr>
@@ -1623,17 +1612,8 @@
     <w:next w:val="Textoindependiente"/>
     <w:qFormat/>
     <w:pPr>
-      <w:spacing w:before="0" w:after="40" w:line="240" w:lineRule="auto"/>
-      <w:ind w:left="0" w:right="0" w:firstLine="0"/>
-      <w:jc w:val="both"/>
-    </w:pPr>
-    <w:rPr>
-      <w:rFonts w:ascii="Times New Roman" w:hAnsi="Times New Roman" w:eastAsia="Times New Roman" w:cs="Times New Roman"/>
-      <w:b w:val="0"/>
-      <w:i w:val="0"/>
-      <w:color w:val="000000"/>
-      <w:sz w:val="24"/>
-    </w:rPr>
+      <w:ind w:firstLine="0"/>
+    </w:pPr>
   </w:style>
   <w:style w:type="paragraph" w:customStyle="1" w:styleId="Compact">
     <w:name w:val="Compact"/>
@@ -1653,16 +1633,14 @@
     <w:rsid w:val="00A10FD9"/>
     <w:pPr>
       <w:keepNext/>
-      <w:widowControl/>
-      <w:spacing w:after="360" w:line="240" w:lineRule="auto" w:before="0"/>
-      <w:ind w:firstLine="0" w:left="0" w:right="0"/>
+      <w:spacing w:after="360" w:line="240" w:lineRule="auto"/>
+      <w:ind w:firstLine="0"/>
       <w:contextualSpacing/>
       <w:jc w:val="center"/>
     </w:pPr>
     <w:rPr>
-      <w:rFonts w:asciiTheme="majorHAnsi" w:eastAsiaTheme="majorEastAsia" w:hAnsiTheme="majorHAnsi" w:cstheme="majorBidi" w:ascii="Times New Roman" w:hAnsi="Times New Roman" w:eastAsia="Times New Roman" w:cs="Times New Roman"/>
+      <w:rFonts w:asciiTheme="majorHAnsi" w:eastAsiaTheme="majorEastAsia" w:hAnsiTheme="majorHAnsi" w:cstheme="majorBidi"/>
       <w:b/>
-      <w:i w:val="0"/>
       <w:color w:val="1F4E79"/>
       <w:sz w:val="48"/>
       <w:szCs w:val="56"/>
@@ -1689,17 +1667,12 @@
     <w:qFormat/>
     <w:rsid w:val="00A10FD9"/>
     <w:pPr>
-      <w:keepNext/>
-      <w:widowControl/>
       <w:numPr>
         <w:ilvl w:val="1"/>
       </w:numPr>
-      <w:spacing w:before="0" w:after="360" w:line="240" w:lineRule="auto"/>
-      <w:ind w:firstLine="0" w:left="0" w:right="0"/>
-      <w:jc w:val="center"/>
-    </w:pPr>
-    <w:rPr>
-      <w:rFonts w:ascii="Times New Roman" w:hAnsi="Times New Roman" w:eastAsia="Times New Roman" w:cs="Times New Roman"/>
+    </w:pPr>
+    <w:rPr>
+      <w:rFonts w:ascii="Times New Roman" w:eastAsia="Times New Roman" w:hAnsi="Times New Roman" w:cs="Times New Roman"/>
       <w:b w:val="0"/>
       <w:i/>
       <w:color w:val="222222"/>
@@ -1730,15 +1703,11 @@
     <w:pPr>
       <w:keepNext w:val="0"/>
       <w:keepLines/>
-      <w:widowControl/>
-      <w:spacing w:before="120" w:after="120" w:line="240" w:lineRule="auto"/>
-      <w:ind w:firstLine="0" w:left="0" w:right="0"/>
-      <w:jc w:val="center"/>
-    </w:pPr>
-    <w:rPr>
-      <w:rFonts w:ascii="Times New Roman" w:hAnsi="Times New Roman" w:eastAsia="Times New Roman" w:cs="Times New Roman"/>
+      <w:spacing w:before="120" w:after="120"/>
+    </w:pPr>
+    <w:rPr>
+      <w:rFonts w:ascii="Times New Roman" w:eastAsia="Times New Roman" w:hAnsi="Times New Roman" w:cs="Times New Roman"/>
       <w:b w:val="0"/>
-      <w:i w:val="0"/>
       <w:color w:val="222222"/>
       <w:sz w:val="24"/>
       <w:szCs w:val="24"/>
@@ -1752,15 +1721,11 @@
     <w:pPr>
       <w:keepNext w:val="0"/>
       <w:keepLines/>
-      <w:widowControl/>
-      <w:spacing w:before="60" w:after="240" w:line="240" w:lineRule="auto"/>
-      <w:ind w:firstLine="0" w:left="0" w:right="0"/>
-      <w:jc w:val="center"/>
-    </w:pPr>
-    <w:rPr>
-      <w:rFonts w:ascii="Times New Roman" w:hAnsi="Times New Roman" w:eastAsia="Times New Roman" w:cs="Times New Roman"/>
+      <w:spacing w:before="60" w:after="240"/>
+    </w:pPr>
+    <w:rPr>
+      <w:rFonts w:ascii="Times New Roman" w:eastAsia="Times New Roman" w:hAnsi="Times New Roman" w:cs="Times New Roman"/>
       <w:b w:val="0"/>
-      <w:i w:val="0"/>
       <w:color w:val="222222"/>
       <w:sz w:val="22"/>
       <w:szCs w:val="24"/>
@@ -1803,17 +1768,10 @@
     <w:basedOn w:val="Normal"/>
     <w:qFormat/>
     <w:pPr>
-      <w:keepNext w:val="0"/>
-      <w:widowControl/>
-      <w:spacing w:before="0" w:after="80" w:line="240" w:lineRule="auto"/>
-      <w:ind w:left="720" w:right="0" w:hanging="720"/>
-      <w:jc w:val="both"/>
-    </w:pPr>
-    <w:rPr>
-      <w:rFonts w:ascii="Times New Roman" w:hAnsi="Times New Roman" w:eastAsia="Times New Roman" w:cs="Times New Roman"/>
-      <w:b w:val="0"/>
-      <w:i w:val="0"/>
-      <w:color w:val="222222"/>
+      <w:spacing w:after="80" w:line="240" w:lineRule="auto"/>
+      <w:ind w:left="720" w:hanging="720"/>
+    </w:pPr>
+    <w:rPr>
       <w:sz w:val="21"/>
     </w:rPr>
   </w:style>
@@ -1942,16 +1900,10 @@
     <w:qFormat/>
     <w:rsid w:val="003A3387"/>
     <w:pPr>
-      <w:keepNext w:val="0"/>
-      <w:widowControl/>
-      <w:spacing w:before="80" w:after="120" w:line="240" w:lineRule="auto"/>
-      <w:ind w:firstLine="0" w:left="720" w:right="0"/>
-      <w:jc w:val="both"/>
-    </w:pPr>
-    <w:rPr>
-      <w:rFonts w:ascii="Times New Roman" w:hAnsi="Times New Roman" w:eastAsia="Times New Roman" w:cs="Times New Roman"/>
-      <w:b w:val="0"/>
-      <w:i w:val="0"/>
+      <w:spacing w:before="80" w:after="120"/>
+      <w:ind w:left="720" w:firstLine="0"/>
+    </w:pPr>
+    <w:rPr>
       <w:color w:val="222222"/>
       <w:sz w:val="21"/>
     </w:rPr>
@@ -1971,14 +1923,11 @@
     <w:unhideWhenUsed/>
     <w:qFormat/>
     <w:pPr>
-      <w:spacing w:before="0" w:after="0" w:line="240" w:lineRule="auto"/>
-      <w:ind w:left="0" w:right="0" w:firstLine="0"/>
+      <w:spacing w:after="0" w:line="240" w:lineRule="auto"/>
+      <w:ind w:firstLine="0"/>
       <w:jc w:val="left"/>
     </w:pPr>
     <w:rPr>
-      <w:rFonts w:ascii="Times New Roman" w:hAnsi="Times New Roman" w:eastAsia="Times New Roman" w:cs="Times New Roman"/>
-      <w:b w:val="0"/>
-      <w:i w:val="0"/>
       <w:color w:val="000000"/>
       <w:sz w:val="20"/>
     </w:rPr>
@@ -2028,17 +1977,11 @@
     <w:basedOn w:val="Normal"/>
     <w:link w:val="DescripcinCar"/>
     <w:pPr>
-      <w:keepNext w:val="0"/>
-      <w:widowControl/>
-      <w:spacing w:after="160" w:before="120" w:line="240" w:lineRule="auto"/>
-      <w:ind w:firstLine="0" w:left="0" w:right="0"/>
+      <w:spacing w:before="120" w:after="160" w:line="240" w:lineRule="auto"/>
+      <w:ind w:firstLine="0"/>
       <w:jc w:val="center"/>
     </w:pPr>
     <w:rPr>
-      <w:rFonts w:ascii="Times New Roman" w:hAnsi="Times New Roman" w:eastAsia="Times New Roman" w:cs="Times New Roman"/>
-      <w:b w:val="0"/>
-      <w:i w:val="0"/>
-      <w:color w:val="222222"/>
       <w:sz w:val="20"/>
     </w:rPr>
   </w:style>
@@ -2047,16 +1990,11 @@
     <w:basedOn w:val="Descripcin"/>
     <w:pPr>
       <w:keepNext/>
-      <w:spacing w:before="0" w:after="20" w:line="240" w:lineRule="auto"/>
-      <w:ind w:firstLine="0" w:left="0" w:right="0"/>
+      <w:spacing w:before="0" w:after="20"/>
       <w:jc w:val="left"/>
     </w:pPr>
     <w:rPr>
-      <w:rFonts w:ascii="Times New Roman" w:hAnsi="Times New Roman" w:eastAsia="Times New Roman" w:cs="Times New Roman"/>
-      <w:b w:val="0"/>
-      <w:i w:val="0"/>
       <w:color w:val="000000"/>
-      <w:sz w:val="20"/>
     </w:rPr>
   </w:style>
   <w:style w:type="paragraph" w:customStyle="1" w:styleId="ImageCaption">
@@ -2064,16 +2002,11 @@
     <w:basedOn w:val="Descripcin"/>
     <w:pPr>
       <w:keepNext/>
-      <w:spacing w:before="0" w:after="0" w:line="240" w:lineRule="auto"/>
-      <w:ind w:firstLine="0" w:left="0" w:right="0"/>
+      <w:spacing w:before="0" w:after="0"/>
       <w:jc w:val="left"/>
     </w:pPr>
     <w:rPr>
-      <w:rFonts w:ascii="Times New Roman" w:hAnsi="Times New Roman" w:eastAsia="Times New Roman" w:cs="Times New Roman"/>
-      <w:b w:val="0"/>
-      <w:i w:val="0"/>
       <w:color w:val="000000"/>
-      <w:sz w:val="20"/>
     </w:rPr>
   </w:style>
   <w:style w:type="paragraph" w:customStyle="1" w:styleId="Figure">
@@ -2096,7 +2029,7 @@
     <w:name w:val="Verbatim Char"/>
     <w:basedOn w:val="DescripcinCar"/>
     <w:rPr>
-      <w:rFonts w:ascii="Consolas" w:hAnsi="Consolas" w:eastAsia="Consolas"/>
+      <w:rFonts w:ascii="Consolas" w:eastAsia="Consolas" w:hAnsi="Consolas"/>
       <w:color w:val="222222"/>
       <w:sz w:val="18"/>
     </w:rPr>
@@ -2127,14 +2060,12 @@
     <w:unhideWhenUsed/>
     <w:qFormat/>
     <w:pPr>
-      <w:spacing w:line="480" w:lineRule="auto" w:before="0" w:after="0"/>
-      <w:ind w:firstLine="0" w:left="0" w:right="0"/>
+      <w:spacing w:before="0" w:after="0" w:line="480" w:lineRule="auto"/>
       <w:jc w:val="center"/>
       <w:outlineLvl w:val="9"/>
     </w:pPr>
     <w:rPr>
-      <w:rFonts w:asciiTheme="majorHAnsi" w:hAnsiTheme="majorHAnsi" w:ascii="Times New Roman" w:hAnsi="Times New Roman" w:eastAsia="Times New Roman" w:cs="Times New Roman"/>
-      <w:b/>
+      <w:rFonts w:asciiTheme="majorHAnsi" w:eastAsia="Times New Roman" w:hAnsiTheme="majorHAnsi" w:cs="Times New Roman"/>
       <w:color w:val="000000"/>
       <w:sz w:val="24"/>
     </w:rPr>
@@ -2145,33 +2076,24 @@
     <w:link w:val="Textoindependiente"/>
     <w:rsid w:val="00DA19DD"/>
   </w:style>
-  <w:style w:type="paragraph" w:customStyle="1" w:styleId="Quote">
-    <w:name w:val="Quote"/>
-    <w:pPr>
-      <w:spacing w:before="0" w:after="0" w:line="480" w:lineRule="auto"/>
-      <w:ind w:firstLine="0" w:left="720" w:right="0"/>
-      <w:jc w:val="left"/>
-    </w:pPr>
-    <w:rPr>
-      <w:rFonts w:ascii="Times New Roman" w:hAnsi="Times New Roman" w:eastAsia="Times New Roman" w:cs="Times New Roman"/>
-      <w:b w:val="0"/>
-      <w:i w:val="0"/>
+  <w:style w:type="paragraph" w:customStyle="1" w:styleId="Cita1">
+    <w:name w:val="Cita1"/>
+    <w:pPr>
+      <w:spacing w:after="0" w:line="480" w:lineRule="auto"/>
+      <w:ind w:left="720"/>
+    </w:pPr>
+    <w:rPr>
+      <w:rFonts w:ascii="Times New Roman" w:eastAsia="Times New Roman" w:hAnsi="Times New Roman" w:cs="Times New Roman"/>
       <w:color w:val="000000"/>
-      <w:sz w:val="24"/>
     </w:rPr>
   </w:style>
   <w:style w:type="paragraph" w:customStyle="1" w:styleId="TableText">
     <w:name w:val="Table Text"/>
     <w:pPr>
-      <w:keepNext w:val="0"/>
-      <w:spacing w:before="0" w:after="0" w:line="240" w:lineRule="auto"/>
-      <w:ind w:firstLine="0" w:left="0" w:right="0"/>
-      <w:jc w:val="left"/>
-    </w:pPr>
-    <w:rPr>
-      <w:rFonts w:ascii="Times New Roman" w:hAnsi="Times New Roman" w:eastAsia="Times New Roman" w:cs="Times New Roman"/>
-      <w:b w:val="0"/>
-      <w:i w:val="0"/>
+      <w:spacing w:after="0"/>
+    </w:pPr>
+    <w:rPr>
+      <w:rFonts w:ascii="Times New Roman" w:eastAsia="Times New Roman" w:hAnsi="Times New Roman" w:cs="Times New Roman"/>
       <w:color w:val="000000"/>
       <w:sz w:val="20"/>
     </w:rPr>
@@ -2179,151 +2101,123 @@
   <w:style w:type="paragraph" w:customStyle="1" w:styleId="TableNote">
     <w:name w:val="Table Note"/>
     <w:pPr>
-      <w:keepNext w:val="0"/>
-      <w:spacing w:before="0" w:after="20" w:line="240" w:lineRule="auto"/>
-      <w:ind w:firstLine="0" w:left="0" w:right="0"/>
-      <w:jc w:val="left"/>
-    </w:pPr>
-    <w:rPr>
-      <w:rFonts w:ascii="Times New Roman" w:hAnsi="Times New Roman" w:eastAsia="Times New Roman" w:cs="Times New Roman"/>
-      <w:b w:val="0"/>
-      <w:i w:val="0"/>
+      <w:spacing w:after="20"/>
+    </w:pPr>
+    <w:rPr>
+      <w:rFonts w:ascii="Times New Roman" w:eastAsia="Times New Roman" w:hAnsi="Times New Roman" w:cs="Times New Roman"/>
       <w:color w:val="000000"/>
       <w:sz w:val="20"/>
     </w:rPr>
   </w:style>
-  <w:style w:type="paragraph" w:customStyle="1" w:styleId="FootnoteText">
-    <w:name w:val="Footnote Text"/>
-    <w:pPr>
-      <w:spacing w:before="0" w:after="0" w:line="240" w:lineRule="auto"/>
-      <w:ind w:firstLine="0" w:left="0" w:right="0"/>
+  <w:style w:type="paragraph" w:customStyle="1" w:styleId="Textonotapie1">
+    <w:name w:val="Texto nota pie1"/>
+    <w:pPr>
+      <w:spacing w:after="0"/>
       <w:jc w:val="both"/>
     </w:pPr>
     <w:rPr>
-      <w:rFonts w:ascii="Times New Roman" w:hAnsi="Times New Roman" w:eastAsia="Times New Roman" w:cs="Times New Roman"/>
-      <w:b w:val="0"/>
-      <w:i w:val="0"/>
+      <w:rFonts w:ascii="Times New Roman" w:eastAsia="Times New Roman" w:hAnsi="Times New Roman" w:cs="Times New Roman"/>
       <w:color w:val="000000"/>
       <w:sz w:val="18"/>
     </w:rPr>
   </w:style>
-  <w:style w:type="paragraph" w:customStyle="1" w:styleId="TOC1">
-    <w:name w:val="TOC 1"/>
-    <w:pPr>
-      <w:spacing w:before="0" w:after="0" w:line="240" w:lineRule="auto"/>
-      <w:ind w:firstLine="0" w:left="0" w:right="0"/>
-      <w:jc w:val="left"/>
-    </w:pPr>
-    <w:rPr>
-      <w:rFonts w:ascii="Times New Roman" w:hAnsi="Times New Roman" w:eastAsia="Times New Roman" w:cs="Times New Roman"/>
-      <w:sz w:val="24"/>
-    </w:rPr>
-  </w:style>
-  <w:style w:type="paragraph" w:customStyle="1" w:styleId="TOC2">
-    <w:name w:val="TOC 2"/>
-    <w:pPr>
-      <w:spacing w:before="0" w:after="0" w:line="240" w:lineRule="auto"/>
-      <w:ind w:firstLine="0" w:left="360" w:right="0"/>
-      <w:jc w:val="left"/>
-    </w:pPr>
-    <w:rPr>
-      <w:rFonts w:ascii="Times New Roman" w:hAnsi="Times New Roman" w:eastAsia="Times New Roman" w:cs="Times New Roman"/>
-      <w:sz w:val="24"/>
-    </w:rPr>
-  </w:style>
-  <w:style w:type="paragraph" w:customStyle="1" w:styleId="TOC3">
-    <w:name w:val="TOC 3"/>
-    <w:pPr>
-      <w:spacing w:before="0" w:after="0" w:line="240" w:lineRule="auto"/>
-      <w:ind w:firstLine="0" w:left="720" w:right="0"/>
-      <w:jc w:val="left"/>
-    </w:pPr>
-    <w:rPr>
-      <w:rFonts w:ascii="Times New Roman" w:hAnsi="Times New Roman" w:eastAsia="Times New Roman" w:cs="Times New Roman"/>
-      <w:sz w:val="24"/>
-    </w:rPr>
-  </w:style>
-  <w:style w:type="paragraph" w:customStyle="1" w:styleId="TOC4">
-    <w:name w:val="TOC 4"/>
-    <w:pPr>
-      <w:spacing w:before="0" w:after="0" w:line="240" w:lineRule="auto"/>
-      <w:ind w:firstLine="0" w:left="1080" w:right="0"/>
-      <w:jc w:val="left"/>
-    </w:pPr>
-    <w:rPr>
-      <w:rFonts w:ascii="Times New Roman" w:hAnsi="Times New Roman" w:eastAsia="Times New Roman" w:cs="Times New Roman"/>
-      <w:sz w:val="24"/>
-    </w:rPr>
-  </w:style>
-  <w:style w:type="paragraph" w:customStyle="1" w:styleId="TOC5">
-    <w:name w:val="TOC 5"/>
-    <w:pPr>
-      <w:spacing w:before="0" w:after="0" w:line="240" w:lineRule="auto"/>
-      <w:ind w:firstLine="0" w:left="1440" w:right="0"/>
-      <w:jc w:val="left"/>
-    </w:pPr>
-    <w:rPr>
-      <w:rFonts w:ascii="Times New Roman" w:hAnsi="Times New Roman" w:eastAsia="Times New Roman" w:cs="Times New Roman"/>
-      <w:sz w:val="24"/>
-    </w:rPr>
-  </w:style>
-  <w:style w:type="paragraph" w:customStyle="1" w:styleId="TOC6">
-    <w:name w:val="TOC 6"/>
-    <w:pPr>
-      <w:spacing w:before="0" w:after="0" w:line="240" w:lineRule="auto"/>
-      <w:ind w:firstLine="0" w:left="1800" w:right="0"/>
-      <w:jc w:val="left"/>
-    </w:pPr>
-    <w:rPr>
-      <w:rFonts w:ascii="Times New Roman" w:hAnsi="Times New Roman" w:eastAsia="Times New Roman" w:cs="Times New Roman"/>
-      <w:sz w:val="24"/>
-    </w:rPr>
-  </w:style>
-  <w:style w:type="paragraph" w:customStyle="1" w:styleId="TOC7">
-    <w:name w:val="TOC 7"/>
-    <w:pPr>
-      <w:spacing w:before="0" w:after="0" w:line="240" w:lineRule="auto"/>
-      <w:ind w:firstLine="0" w:left="2160" w:right="0"/>
-      <w:jc w:val="left"/>
-    </w:pPr>
-    <w:rPr>
-      <w:rFonts w:ascii="Times New Roman" w:hAnsi="Times New Roman" w:eastAsia="Times New Roman" w:cs="Times New Roman"/>
-      <w:sz w:val="24"/>
-    </w:rPr>
-  </w:style>
-  <w:style w:type="paragraph" w:customStyle="1" w:styleId="TOC8">
-    <w:name w:val="TOC 8"/>
-    <w:pPr>
-      <w:spacing w:before="0" w:after="0" w:line="240" w:lineRule="auto"/>
-      <w:ind w:firstLine="0" w:left="2520" w:right="0"/>
-      <w:jc w:val="left"/>
-    </w:pPr>
-    <w:rPr>
-      <w:rFonts w:ascii="Times New Roman" w:hAnsi="Times New Roman" w:eastAsia="Times New Roman" w:cs="Times New Roman"/>
-      <w:sz w:val="24"/>
-    </w:rPr>
-  </w:style>
-  <w:style w:type="paragraph" w:customStyle="1" w:styleId="TOC9">
-    <w:name w:val="TOC 9"/>
-    <w:pPr>
-      <w:spacing w:before="0" w:after="0" w:line="240" w:lineRule="auto"/>
-      <w:ind w:firstLine="0" w:left="2880" w:right="0"/>
-      <w:jc w:val="left"/>
-    </w:pPr>
-    <w:rPr>
-      <w:rFonts w:ascii="Times New Roman" w:hAnsi="Times New Roman" w:eastAsia="Times New Roman" w:cs="Times New Roman"/>
-      <w:sz w:val="24"/>
+  <w:style w:type="paragraph" w:customStyle="1" w:styleId="TDC11">
+    <w:name w:val="TDC 11"/>
+    <w:pPr>
+      <w:spacing w:after="0"/>
+    </w:pPr>
+    <w:rPr>
+      <w:rFonts w:ascii="Times New Roman" w:eastAsia="Times New Roman" w:hAnsi="Times New Roman" w:cs="Times New Roman"/>
+    </w:rPr>
+  </w:style>
+  <w:style w:type="paragraph" w:customStyle="1" w:styleId="TDC21">
+    <w:name w:val="TDC 21"/>
+    <w:pPr>
+      <w:spacing w:after="0"/>
+      <w:ind w:left="360"/>
+    </w:pPr>
+    <w:rPr>
+      <w:rFonts w:ascii="Times New Roman" w:eastAsia="Times New Roman" w:hAnsi="Times New Roman" w:cs="Times New Roman"/>
+    </w:rPr>
+  </w:style>
+  <w:style w:type="paragraph" w:customStyle="1" w:styleId="TDC31">
+    <w:name w:val="TDC 31"/>
+    <w:pPr>
+      <w:spacing w:after="0"/>
+      <w:ind w:left="720"/>
+    </w:pPr>
+    <w:rPr>
+      <w:rFonts w:ascii="Times New Roman" w:eastAsia="Times New Roman" w:hAnsi="Times New Roman" w:cs="Times New Roman"/>
+    </w:rPr>
+  </w:style>
+  <w:style w:type="paragraph" w:customStyle="1" w:styleId="TDC41">
+    <w:name w:val="TDC 41"/>
+    <w:pPr>
+      <w:spacing w:after="0"/>
+      <w:ind w:left="1080"/>
+    </w:pPr>
+    <w:rPr>
+      <w:rFonts w:ascii="Times New Roman" w:eastAsia="Times New Roman" w:hAnsi="Times New Roman" w:cs="Times New Roman"/>
+    </w:rPr>
+  </w:style>
+  <w:style w:type="paragraph" w:customStyle="1" w:styleId="TDC51">
+    <w:name w:val="TDC 51"/>
+    <w:pPr>
+      <w:spacing w:after="0"/>
+      <w:ind w:left="1440"/>
+    </w:pPr>
+    <w:rPr>
+      <w:rFonts w:ascii="Times New Roman" w:eastAsia="Times New Roman" w:hAnsi="Times New Roman" w:cs="Times New Roman"/>
+    </w:rPr>
+  </w:style>
+  <w:style w:type="paragraph" w:customStyle="1" w:styleId="TDC61">
+    <w:name w:val="TDC 61"/>
+    <w:pPr>
+      <w:spacing w:after="0"/>
+      <w:ind w:left="1800"/>
+    </w:pPr>
+    <w:rPr>
+      <w:rFonts w:ascii="Times New Roman" w:eastAsia="Times New Roman" w:hAnsi="Times New Roman" w:cs="Times New Roman"/>
+    </w:rPr>
+  </w:style>
+  <w:style w:type="paragraph" w:customStyle="1" w:styleId="TDC71">
+    <w:name w:val="TDC 71"/>
+    <w:pPr>
+      <w:spacing w:after="0"/>
+      <w:ind w:left="2160"/>
+    </w:pPr>
+    <w:rPr>
+      <w:rFonts w:ascii="Times New Roman" w:eastAsia="Times New Roman" w:hAnsi="Times New Roman" w:cs="Times New Roman"/>
+    </w:rPr>
+  </w:style>
+  <w:style w:type="paragraph" w:customStyle="1" w:styleId="TDC81">
+    <w:name w:val="TDC 81"/>
+    <w:pPr>
+      <w:spacing w:after="0"/>
+      <w:ind w:left="2520"/>
+    </w:pPr>
+    <w:rPr>
+      <w:rFonts w:ascii="Times New Roman" w:eastAsia="Times New Roman" w:hAnsi="Times New Roman" w:cs="Times New Roman"/>
+    </w:rPr>
+  </w:style>
+  <w:style w:type="paragraph" w:customStyle="1" w:styleId="TDC91">
+    <w:name w:val="TDC 91"/>
+    <w:pPr>
+      <w:spacing w:after="0"/>
+      <w:ind w:left="2880"/>
+    </w:pPr>
+    <w:rPr>
+      <w:rFonts w:ascii="Times New Roman" w:eastAsia="Times New Roman" w:hAnsi="Times New Roman" w:cs="Times New Roman"/>
     </w:rPr>
   </w:style>
   <w:style w:type="paragraph" w:customStyle="1" w:styleId="FigureCaption">
     <w:name w:val="Figure Caption"/>
     <w:pPr>
       <w:keepNext/>
-      <w:spacing w:before="0" w:after="20" w:line="240" w:lineRule="auto"/>
-      <w:jc w:val="left"/>
-    </w:pPr>
-    <w:rPr>
-      <w:rFonts w:ascii="Times New Roman" w:hAnsi="Times New Roman" w:eastAsia="Times New Roman" w:cs="Times New Roman"/>
+      <w:spacing w:after="20"/>
+    </w:pPr>
+    <w:rPr>
+      <w:rFonts w:ascii="Times New Roman" w:eastAsia="Times New Roman" w:hAnsi="Times New Roman" w:cs="Times New Roman"/>
       <w:sz w:val="20"/>
     </w:rPr>
   </w:style>

</xml_diff>